<commit_message>
Financement : crédit-bail sur les machines uniquement, sans prêt ni apport familial ; modèle, docs, business plan et pitch mis à jour
Co-Authored-By: Claude Opus 5.5 <noreply@anthropic.com>
Claude-Session: https://claude.ai/code/session_01Y9tvBbEvmEfAUPhcEjES6m
</commit_message>
<xml_diff>
--- a/livrables/setal-pro-business-plan.docx
+++ b/livrables/setal-pro-business-plan.docx
@@ -524,7 +524,7 @@
                 <w:sz w:val="18"/>
                 <w:szCs w:val="18"/>
               </w:rPr>
-              <w:t xml:space="preserve">Octobre 2030, après une validation terrain en 2027-2028 (décision de lancement en mars 2028)</w:t>
+              <w:t xml:space="preserve">Octobre 2030 visé, après une validation terrain en 2027-2028 ; date confirmée en mars 2028 selon l'épargne et les prix réels (2032 à 2034 si l'épargne reste à 1 000 €/mois)</w:t>
             </w:r>
           </w:p>
         </w:tc>
@@ -662,7 +662,7 @@
                 <w:sz w:val="18"/>
                 <w:szCs w:val="18"/>
               </w:rPr>
-              <w:t xml:space="preserve">Besoin de financement</w:t>
+              <w:t xml:space="preserve">Financement</w:t>
             </w:r>
           </w:p>
         </w:tc>
@@ -687,7 +687,7 @@
                 <w:sz w:val="18"/>
                 <w:szCs w:val="18"/>
               </w:rPr>
-              <w:t xml:space="preserve">≈ 67,7 M FCFA (coussin inclus) ; apport du porteur ≈ 24,4 M FCFA ; complément recherché ≈ 43,3 M FCFA</w:t>
+              <w:t xml:space="preserve">Apport personnel uniquement, plus un crédit-bail sur les machines (≈ 15,1 M FCFA). Besoin restant ≈ 56,9 M FCFA (coussin inclus) pour ≈ 24,4 M d'épargne en oct. 2030 : l'écart (≈ 32,6 M) est comblé par l'épargne et le choix de la date d'ouverture</w:t>
             </w:r>
           </w:p>
         </w:tc>
@@ -711,7 +711,7 @@
           <w:sz w:val="21"/>
           <w:szCs w:val="21"/>
         </w:rPr>
-        <w:t xml:space="preserve">Ce que nous demandons aujourd'hui :</w:t>
+        <w:t xml:space="preserve">Ce que nous demandons :</w:t>
       </w:r>
       <w:r>
         <w:rPr>
@@ -719,7 +719,25 @@
           <w:sz w:val="21"/>
           <w:szCs w:val="21"/>
         </w:rPr>
-        <w:t xml:space="preserve"> aucun financement immédiat. Ce document sert à ouvrir le dialogue avec des banques et des partenaires dès 2027, pour préparer un financement complémentaire (crédit-bail, prêt garanti, apports familiaux) à mobiliser en 2029-2030 si la validation terrain est concluante.</w:t>
+        <w:t xml:space="preserve"> aucun prêt. Le projet est financé par l'apport personnel du porteur. Le seul financement extérieur recherché est un </w:t>
+      </w:r>
+      <w:r>
+        <w:rPr>
+          <w:rFonts w:ascii="Arial" w:cs="Arial" w:eastAsia="Arial" w:hAnsi="Arial"/>
+          <w:b/>
+          <w:bCs/>
+          <w:sz w:val="21"/>
+          <w:szCs w:val="21"/>
+        </w:rPr>
+        <w:t xml:space="preserve">crédit-bail sur les machines</w:t>
+      </w:r>
+      <w:r>
+        <w:rPr>
+          <w:rFonts w:ascii="Arial" w:cs="Arial" w:eastAsia="Arial" w:hAnsi="Arial"/>
+          <w:sz w:val="21"/>
+          <w:szCs w:val="21"/>
+        </w:rPr>
+        <w:t xml:space="preserve"> (laveuses, séchoirs, calandre), à mettre en place en 2029-2030 si la validation terrain est concluante. Ce document sert à obtenir des offres de sociétés de crédit-bail.</w:t>
       </w:r>
     </w:p>
     <w:p>
@@ -1096,7 +1114,7 @@
                 <w:sz w:val="18"/>
                 <w:szCs w:val="18"/>
               </w:rPr>
-              <w:t xml:space="preserve">Pas encore de relation bancaire</w:t>
+              <w:t xml:space="preserve">Pas encore de relation financière au Sénégal</w:t>
             </w:r>
           </w:p>
         </w:tc>
@@ -1120,7 +1138,7 @@
                 <w:sz w:val="18"/>
                 <w:szCs w:val="18"/>
               </w:rPr>
-              <w:t xml:space="preserve">Ouverture d'un compte et premier rendez-vous bancaire dès 2028, avec ce business plan</w:t>
+              <w:t xml:space="preserve">Compte bancaire professionnel ouvert à la création ; rendez-vous avec 2 ou 3 sociétés de crédit-bail dès 2028</w:t>
             </w:r>
           </w:p>
         </w:tc>
@@ -4784,7 +4802,7 @@
                 <w:sz w:val="18"/>
                 <w:szCs w:val="18"/>
               </w:rPr>
-              <w:t xml:space="preserve">-15,5</w:t>
+              <w:t xml:space="preserve">-17,2</w:t>
             </w:r>
           </w:p>
         </w:tc>
@@ -4808,7 +4826,7 @@
                 <w:sz w:val="18"/>
                 <w:szCs w:val="18"/>
               </w:rPr>
-              <w:t xml:space="preserve">11,8</w:t>
+              <w:t xml:space="preserve">10,4</w:t>
             </w:r>
           </w:p>
         </w:tc>
@@ -4832,7 +4850,7 @@
                 <w:sz w:val="18"/>
                 <w:szCs w:val="18"/>
               </w:rPr>
-              <w:t xml:space="preserve">17,2</w:t>
+              <w:t xml:space="preserve">17,3</w:t>
             </w:r>
           </w:p>
         </w:tc>
@@ -4856,7 +4874,7 @@
                 <w:sz w:val="18"/>
                 <w:szCs w:val="18"/>
               </w:rPr>
-              <w:t xml:space="preserve">22,9</w:t>
+              <w:t xml:space="preserve">22,4</w:t>
             </w:r>
           </w:p>
         </w:tc>
@@ -4880,7 +4898,7 @@
                 <w:sz w:val="18"/>
                 <w:szCs w:val="18"/>
               </w:rPr>
-              <w:t xml:space="preserve">32,5</w:t>
+              <w:t xml:space="preserve">32,4</w:t>
             </w:r>
           </w:p>
         </w:tc>
@@ -4935,7 +4953,7 @@
                 <w:sz w:val="18"/>
                 <w:szCs w:val="18"/>
               </w:rPr>
-              <w:t xml:space="preserve">-35,7</w:t>
+              <w:t xml:space="preserve">-24,6</w:t>
             </w:r>
           </w:p>
         </w:tc>
@@ -4960,7 +4978,7 @@
                 <w:sz w:val="18"/>
                 <w:szCs w:val="18"/>
               </w:rPr>
-              <w:t xml:space="preserve">-21,6</w:t>
+              <w:t xml:space="preserve">-14,5</w:t>
             </w:r>
           </w:p>
         </w:tc>
@@ -4985,7 +5003,7 @@
                 <w:sz w:val="18"/>
                 <w:szCs w:val="18"/>
               </w:rPr>
-              <w:t xml:space="preserve">3,8</w:t>
+              <w:t xml:space="preserve">6,8</w:t>
             </w:r>
           </w:p>
         </w:tc>
@@ -5010,7 +5028,7 @@
                 <w:sz w:val="18"/>
                 <w:szCs w:val="18"/>
               </w:rPr>
-              <w:t xml:space="preserve">26,6</w:t>
+              <w:t xml:space="preserve">26,9</w:t>
             </w:r>
           </w:p>
         </w:tc>
@@ -5035,7 +5053,7 @@
                 <w:sz w:val="18"/>
                 <w:szCs w:val="18"/>
               </w:rPr>
-              <w:t xml:space="preserve">68,1</w:t>
+              <w:t xml:space="preserve">64,5</w:t>
             </w:r>
           </w:p>
         </w:tc>
@@ -5910,7 +5928,7 @@
                 <w:sz w:val="18"/>
                 <w:szCs w:val="18"/>
               </w:rPr>
-              <w:t xml:space="preserve">145,2</w:t>
+              <w:t xml:space="preserve">150,5</w:t>
             </w:r>
           </w:p>
         </w:tc>
@@ -5935,7 +5953,7 @@
                 <w:sz w:val="18"/>
                 <w:szCs w:val="18"/>
               </w:rPr>
-              <w:t xml:space="preserve">60,4</w:t>
+              <w:t xml:space="preserve">49,7</w:t>
             </w:r>
           </w:p>
         </w:tc>
@@ -5960,7 +5978,7 @@
                 <w:sz w:val="18"/>
                 <w:szCs w:val="18"/>
               </w:rPr>
-              <w:t xml:space="preserve">48,6</w:t>
+              <w:t xml:space="preserve">34,3</w:t>
             </w:r>
           </w:p>
         </w:tc>
@@ -6010,6 +6028,38 @@
           <w:szCs w:val="30"/>
         </w:rPr>
         <w:t xml:space="preserve">9. Plan de financement</w:t>
+      </w:r>
+    </w:p>
+    <w:p>
+      <w:pPr>
+        <w:spacing w:after="120" w:line="276"/>
+        <w:jc w:val="both"/>
+      </w:pPr>
+      <w:r>
+        <w:rPr>
+          <w:rFonts w:ascii="Arial" w:cs="Arial" w:eastAsia="Arial" w:hAnsi="Arial"/>
+          <w:sz w:val="21"/>
+          <w:szCs w:val="21"/>
+        </w:rPr>
+        <w:t xml:space="preserve">Choix du porteur : </w:t>
+      </w:r>
+      <w:r>
+        <w:rPr>
+          <w:rFonts w:ascii="Arial" w:cs="Arial" w:eastAsia="Arial" w:hAnsi="Arial"/>
+          <w:b/>
+          <w:bCs/>
+          <w:sz w:val="21"/>
+          <w:szCs w:val="21"/>
+        </w:rPr>
+        <w:t xml:space="preserve">apport personnel et crédit-bail sur les machines uniquement</w:t>
+      </w:r>
+      <w:r>
+        <w:rPr>
+          <w:rFonts w:ascii="Arial" w:cs="Arial" w:eastAsia="Arial" w:hAnsi="Arial"/>
+          <w:sz w:val="21"/>
+          <w:szCs w:val="21"/>
+        </w:rPr>
+        <w:t xml:space="preserve">, sans prêt bancaire ni apport familial. Scénario central, version d'investissement frugale, ouverture en octobre 2030.</w:t>
       </w:r>
     </w:p>
     <w:tbl>
@@ -6058,7 +6108,7 @@
                 <w:sz w:val="18"/>
                 <w:szCs w:val="18"/>
               </w:rPr>
-              <w:t xml:space="preserve">Besoins (scénario central, M FCFA)</w:t>
+              <w:t xml:space="preserve">Besoins (M FCFA)</w:t>
             </w:r>
           </w:p>
         </w:tc>
@@ -6219,7 +6269,7 @@
                 <w:sz w:val="18"/>
                 <w:szCs w:val="18"/>
               </w:rPr>
-              <w:t xml:space="preserve">Apport personnel du porteur (épargne mobilisable)</w:t>
+              <w:t xml:space="preserve">Crédit-bail sur les machines</w:t>
             </w:r>
           </w:p>
         </w:tc>
@@ -6243,7 +6293,7 @@
                 <w:sz w:val="18"/>
                 <w:szCs w:val="18"/>
               </w:rPr>
-              <w:t xml:space="preserve">24,4</w:t>
+              <w:t xml:space="preserve">15,1</w:t>
             </w:r>
           </w:p>
         </w:tc>
@@ -6323,7 +6373,7 @@
                 <w:sz w:val="18"/>
                 <w:szCs w:val="18"/>
               </w:rPr>
-              <w:t xml:space="preserve">Financement complémentaire à mobiliser</w:t>
+              <w:t xml:space="preserve">Apport personnel du porteur (épargne)</w:t>
             </w:r>
           </w:p>
         </w:tc>
@@ -6348,7 +6398,7 @@
                 <w:sz w:val="18"/>
                 <w:szCs w:val="18"/>
               </w:rPr>
-              <w:t xml:space="preserve">43,3</w:t>
+              <w:t xml:space="preserve">24,4</w:t>
             </w:r>
           </w:p>
         </w:tc>
@@ -6401,7 +6451,7 @@
                 <w:sz w:val="18"/>
                 <w:szCs w:val="18"/>
               </w:rPr>
-              <w:t xml:space="preserve">11,0</w:t>
+              <w:t xml:space="preserve">15,4</w:t>
             </w:r>
           </w:p>
         </w:tc>
@@ -6419,6 +6469,14 @@
             <w:pPr>
               <w:jc w:val="left"/>
             </w:pPr>
+            <w:r>
+              <w:rPr>
+                <w:rFonts w:ascii="Arial" w:cs="Arial" w:eastAsia="Arial" w:hAnsi="Arial"/>
+                <w:sz w:val="18"/>
+                <w:szCs w:val="18"/>
+              </w:rPr>
+              <w:t xml:space="preserve">Écart restant à couvrir par l'épargne supplémentaire ou un report d'ouverture</w:t>
+            </w:r>
           </w:p>
         </w:tc>
         <w:tc>
@@ -6433,8 +6491,16 @@
           </w:tcPr>
           <w:p>
             <w:pPr>
-              <w:jc w:val="left"/>
-            </w:pPr>
+              <w:jc w:val="right"/>
+            </w:pPr>
+            <w:r>
+              <w:rPr>
+                <w:rFonts w:ascii="Arial" w:cs="Arial" w:eastAsia="Arial" w:hAnsi="Arial"/>
+                <w:sz w:val="18"/>
+                <w:szCs w:val="18"/>
+              </w:rPr>
+              <w:t xml:space="preserve">32,6</w:t>
+            </w:r>
           </w:p>
         </w:tc>
       </w:tr>
@@ -6575,7 +6641,7 @@
                 <w:sz w:val="18"/>
                 <w:szCs w:val="18"/>
               </w:rPr>
-              <w:t xml:space="preserve">67,7</w:t>
+              <w:t xml:space="preserve">72,1</w:t>
             </w:r>
           </w:p>
         </w:tc>
@@ -6623,7 +6689,7 @@
                 <w:sz w:val="18"/>
                 <w:szCs w:val="18"/>
               </w:rPr>
-              <w:t xml:space="preserve">67,7</w:t>
+              <w:t xml:space="preserve">72,1</w:t>
             </w:r>
           </w:p>
         </w:tc>
@@ -6647,7 +6713,7 @@
           <w:sz w:val="21"/>
           <w:szCs w:val="21"/>
         </w:rPr>
-        <w:t xml:space="preserve">Épargne du porteur :</w:t>
+        <w:t xml:space="preserve">Crédit-bail :</w:t>
       </w:r>
       <w:r>
         <w:rPr>
@@ -6655,7 +6721,31 @@
           <w:sz w:val="21"/>
           <w:szCs w:val="21"/>
         </w:rPr>
-        <w:t xml:space="preserve"> 10 M FCFA aujourd'hui, plus 500 € puis 1 000 € par mois jusqu'en 2030, moins les voyages de validation et le déménagement, et moins une réserve personnelle de 12 mois. Il reste environ 24,4 M FCFA mobilisables à l'ouverture.</w:t>
+        <w:t xml:space="preserve"> environ 15,1 M FCFA financés (après 15 % d'apport), sur 60 mois au taux de 12 % (hypothèses), soit un loyer d'environ 337 000 FCFA par mois. Le cadre légal a été modernisé en mai 2026.</w:t>
+      </w:r>
+    </w:p>
+    <w:p>
+      <w:pPr>
+        <w:spacing w:after="120" w:line="276"/>
+        <w:jc w:val="both"/>
+      </w:pPr>
+      <w:r>
+        <w:rPr>
+          <w:rFonts w:ascii="Arial" w:cs="Arial" w:eastAsia="Arial" w:hAnsi="Arial"/>
+          <w:b/>
+          <w:bCs/>
+          <w:sz w:val="21"/>
+          <w:szCs w:val="21"/>
+        </w:rPr>
+        <w:t xml:space="preserve">Épargne du porteur :</w:t>
+      </w:r>
+      <w:r>
+        <w:rPr>
+          <w:rFonts w:ascii="Arial" w:cs="Arial" w:eastAsia="Arial" w:hAnsi="Arial"/>
+          <w:sz w:val="21"/>
+          <w:szCs w:val="21"/>
+        </w:rPr>
+        <w:t xml:space="preserve"> 10 M FCFA aujourd'hui, plus 500 € puis 1 000 € par mois, moins les voyages de validation, le déménagement et une réserve personnelle de 12 mois. Il reste environ 24,4 M FCFA mobilisables en octobre 2030.</w:t>
       </w:r>
     </w:p>
     <w:p>
@@ -6672,17 +6762,439 @@
           <w:sz w:val="24"/>
           <w:szCs w:val="24"/>
         </w:rPr>
-        <w:t xml:space="preserve">Pistes pour le financement complémentaire</w:t>
-      </w:r>
+        <w:t xml:space="preserve">Comment l'écart est comblé sans emprunt</w:t>
+      </w:r>
+    </w:p>
+    <w:tbl>
+      <w:tblPr>
+        <w:tblW w:type="dxa" w:w="9638"/>
+        <w:tblBorders>
+          <w:top w:val="single" w:color="auto" w:sz="4"/>
+          <w:left w:val="single" w:color="auto" w:sz="4"/>
+          <w:bottom w:val="single" w:color="auto" w:sz="4"/>
+          <w:right w:val="single" w:color="auto" w:sz="4"/>
+          <w:insideH w:val="single" w:color="auto" w:sz="4"/>
+          <w:insideV w:val="single" w:color="auto" w:sz="4"/>
+        </w:tblBorders>
+      </w:tblPr>
+      <w:tblGrid>
+        <w:gridCol w:w="5038"/>
+        <w:gridCol w:w="2300"/>
+        <w:gridCol w:w="2300"/>
+      </w:tblGrid>
+      <w:tr>
+        <w:trPr>
+          <w:tblHeader/>
+        </w:trPr>
+        <w:tc>
+          <w:tcPr>
+            <w:tcW w:type="dxa" w:w="5038"/>
+            <w:shd w:fill="1F4E78" w:color="auto" w:val="clear"/>
+            <w:tcMar>
+              <w:top w:type="dxa" w:w="60"/>
+              <w:left w:type="dxa" w:w="90"/>
+              <w:bottom w:type="dxa" w:w="60"/>
+              <w:right w:type="dxa" w:w="90"/>
+            </w:tcMar>
+          </w:tcPr>
+          <w:p>
+            <w:pPr>
+              <w:jc w:val="left"/>
+            </w:pPr>
+            <w:r>
+              <w:rPr>
+                <w:rFonts w:ascii="Arial" w:cs="Arial" w:eastAsia="Arial" w:hAnsi="Arial"/>
+                <w:b/>
+                <w:bCs/>
+                <w:color w:val="FFFFFF"/>
+                <w:sz w:val="18"/>
+                <w:szCs w:val="18"/>
+              </w:rPr>
+              <w:t xml:space="preserve">Option (scénario central)</w:t>
+            </w:r>
+          </w:p>
+        </w:tc>
+        <w:tc>
+          <w:tcPr>
+            <w:tcW w:type="dxa" w:w="2300"/>
+            <w:shd w:fill="1F4E78" w:color="auto" w:val="clear"/>
+            <w:tcMar>
+              <w:top w:type="dxa" w:w="60"/>
+              <w:left w:type="dxa" w:w="90"/>
+              <w:bottom w:type="dxa" w:w="60"/>
+              <w:right w:type="dxa" w:w="90"/>
+            </w:tcMar>
+          </w:tcPr>
+          <w:p>
+            <w:pPr>
+              <w:jc w:val="left"/>
+            </w:pPr>
+            <w:r>
+              <w:rPr>
+                <w:rFonts w:ascii="Arial" w:cs="Arial" w:eastAsia="Arial" w:hAnsi="Arial"/>
+                <w:b/>
+                <w:bCs/>
+                <w:color w:val="FFFFFF"/>
+                <w:sz w:val="18"/>
+                <w:szCs w:val="18"/>
+              </w:rPr>
+              <w:t xml:space="preserve">Épargne mobilisable</w:t>
+            </w:r>
+          </w:p>
+        </w:tc>
+        <w:tc>
+          <w:tcPr>
+            <w:tcW w:type="dxa" w:w="2300"/>
+            <w:shd w:fill="1F4E78" w:color="auto" w:val="clear"/>
+            <w:tcMar>
+              <w:top w:type="dxa" w:w="60"/>
+              <w:left w:type="dxa" w:w="90"/>
+              <w:bottom w:type="dxa" w:w="60"/>
+              <w:right w:type="dxa" w:w="90"/>
+            </w:tcMar>
+          </w:tcPr>
+          <w:p>
+            <w:pPr>
+              <w:jc w:val="left"/>
+            </w:pPr>
+            <w:r>
+              <w:rPr>
+                <w:rFonts w:ascii="Arial" w:cs="Arial" w:eastAsia="Arial" w:hAnsi="Arial"/>
+                <w:b/>
+                <w:bCs/>
+                <w:color w:val="FFFFFF"/>
+                <w:sz w:val="18"/>
+                <w:szCs w:val="18"/>
+              </w:rPr>
+              <w:t xml:space="preserve">Écart</w:t>
+            </w:r>
+          </w:p>
+        </w:tc>
+      </w:tr>
+      <w:tr>
+        <w:trPr>
+          <w:tblHeader w:val="false"/>
+        </w:trPr>
+        <w:tc>
+          <w:tcPr>
+            <w:tcW w:type="dxa" w:w="5038"/>
+            <w:tcMar>
+              <w:top w:type="dxa" w:w="60"/>
+              <w:left w:type="dxa" w:w="90"/>
+              <w:bottom w:type="dxa" w:w="60"/>
+              <w:right w:type="dxa" w:w="90"/>
+            </w:tcMar>
+          </w:tcPr>
+          <w:p>
+            <w:pPr>
+              <w:jc w:val="left"/>
+            </w:pPr>
+            <w:r>
+              <w:rPr>
+                <w:rFonts w:ascii="Arial" w:cs="Arial" w:eastAsia="Arial" w:hAnsi="Arial"/>
+                <w:sz w:val="18"/>
+                <w:szCs w:val="18"/>
+              </w:rPr>
+              <w:t xml:space="preserve">Ouverture en oct. 2030, 1 000 €/mois</w:t>
+            </w:r>
+          </w:p>
+        </w:tc>
+        <w:tc>
+          <w:tcPr>
+            <w:tcW w:type="dxa" w:w="2300"/>
+            <w:tcMar>
+              <w:top w:type="dxa" w:w="60"/>
+              <w:left w:type="dxa" w:w="90"/>
+              <w:bottom w:type="dxa" w:w="60"/>
+              <w:right w:type="dxa" w:w="90"/>
+            </w:tcMar>
+          </w:tcPr>
+          <w:p>
+            <w:pPr>
+              <w:jc w:val="left"/>
+            </w:pPr>
+            <w:r>
+              <w:rPr>
+                <w:rFonts w:ascii="Arial" w:cs="Arial" w:eastAsia="Arial" w:hAnsi="Arial"/>
+                <w:sz w:val="18"/>
+                <w:szCs w:val="18"/>
+              </w:rPr>
+              <w:t xml:space="preserve">24,4 M</w:t>
+            </w:r>
+          </w:p>
+        </w:tc>
+        <w:tc>
+          <w:tcPr>
+            <w:tcW w:type="dxa" w:w="2300"/>
+            <w:tcMar>
+              <w:top w:type="dxa" w:w="60"/>
+              <w:left w:type="dxa" w:w="90"/>
+              <w:bottom w:type="dxa" w:w="60"/>
+              <w:right w:type="dxa" w:w="90"/>
+            </w:tcMar>
+          </w:tcPr>
+          <w:p>
+            <w:pPr>
+              <w:jc w:val="left"/>
+            </w:pPr>
+            <w:r>
+              <w:rPr>
+                <w:rFonts w:ascii="Arial" w:cs="Arial" w:eastAsia="Arial" w:hAnsi="Arial"/>
+                <w:sz w:val="18"/>
+                <w:szCs w:val="18"/>
+              </w:rPr>
+              <w:t xml:space="preserve">– 32,6 M</w:t>
+            </w:r>
+          </w:p>
+        </w:tc>
+      </w:tr>
+      <w:tr>
+        <w:trPr>
+          <w:tblHeader w:val="false"/>
+        </w:trPr>
+        <w:tc>
+          <w:tcPr>
+            <w:tcW w:type="dxa" w:w="5038"/>
+            <w:shd w:fill="F2F6FA" w:color="auto" w:val="clear"/>
+            <w:tcMar>
+              <w:top w:type="dxa" w:w="60"/>
+              <w:left w:type="dxa" w:w="90"/>
+              <w:bottom w:type="dxa" w:w="60"/>
+              <w:right w:type="dxa" w:w="90"/>
+            </w:tcMar>
+          </w:tcPr>
+          <w:p>
+            <w:pPr>
+              <w:jc w:val="left"/>
+            </w:pPr>
+            <w:r>
+              <w:rPr>
+                <w:rFonts w:ascii="Arial" w:cs="Arial" w:eastAsia="Arial" w:hAnsi="Arial"/>
+                <w:sz w:val="18"/>
+                <w:szCs w:val="18"/>
+              </w:rPr>
+              <w:t xml:space="preserve">Ouverture en oct. 2032, 1 500 €/mois dès 2028</w:t>
+            </w:r>
+          </w:p>
+        </w:tc>
+        <w:tc>
+          <w:tcPr>
+            <w:tcW w:type="dxa" w:w="2300"/>
+            <w:shd w:fill="F2F6FA" w:color="auto" w:val="clear"/>
+            <w:tcMar>
+              <w:top w:type="dxa" w:w="60"/>
+              <w:left w:type="dxa" w:w="90"/>
+              <w:bottom w:type="dxa" w:w="60"/>
+              <w:right w:type="dxa" w:w="90"/>
+            </w:tcMar>
+          </w:tcPr>
+          <w:p>
+            <w:pPr>
+              <w:jc w:val="left"/>
+            </w:pPr>
+            <w:r>
+              <w:rPr>
+                <w:rFonts w:ascii="Arial" w:cs="Arial" w:eastAsia="Arial" w:hAnsi="Arial"/>
+                <w:sz w:val="18"/>
+                <w:szCs w:val="18"/>
+              </w:rPr>
+              <w:t xml:space="preserve">58,8 M</w:t>
+            </w:r>
+          </w:p>
+        </w:tc>
+        <w:tc>
+          <w:tcPr>
+            <w:tcW w:type="dxa" w:w="2300"/>
+            <w:shd w:fill="F2F6FA" w:color="auto" w:val="clear"/>
+            <w:tcMar>
+              <w:top w:type="dxa" w:w="60"/>
+              <w:left w:type="dxa" w:w="90"/>
+              <w:bottom w:type="dxa" w:w="60"/>
+              <w:right w:type="dxa" w:w="90"/>
+            </w:tcMar>
+          </w:tcPr>
+          <w:p>
+            <w:pPr>
+              <w:jc w:val="left"/>
+            </w:pPr>
+            <w:r>
+              <w:rPr>
+                <w:rFonts w:ascii="Arial" w:cs="Arial" w:eastAsia="Arial" w:hAnsi="Arial"/>
+                <w:sz w:val="18"/>
+                <w:szCs w:val="18"/>
+              </w:rPr>
+              <w:t xml:space="preserve">+ 1,9 M</w:t>
+            </w:r>
+          </w:p>
+        </w:tc>
+      </w:tr>
+      <w:tr>
+        <w:trPr>
+          <w:tblHeader w:val="false"/>
+        </w:trPr>
+        <w:tc>
+          <w:tcPr>
+            <w:tcW w:type="dxa" w:w="5038"/>
+            <w:tcMar>
+              <w:top w:type="dxa" w:w="60"/>
+              <w:left w:type="dxa" w:w="90"/>
+              <w:bottom w:type="dxa" w:w="60"/>
+              <w:right w:type="dxa" w:w="90"/>
+            </w:tcMar>
+          </w:tcPr>
+          <w:p>
+            <w:pPr>
+              <w:jc w:val="left"/>
+            </w:pPr>
+            <w:r>
+              <w:rPr>
+                <w:rFonts w:ascii="Arial" w:cs="Arial" w:eastAsia="Arial" w:hAnsi="Arial"/>
+                <w:sz w:val="18"/>
+                <w:szCs w:val="18"/>
+              </w:rPr>
+              <w:t xml:space="preserve">Ouverture en oct. 2034, 1 000 €/mois</w:t>
+            </w:r>
+          </w:p>
+        </w:tc>
+        <w:tc>
+          <w:tcPr>
+            <w:tcW w:type="dxa" w:w="2300"/>
+            <w:tcMar>
+              <w:top w:type="dxa" w:w="60"/>
+              <w:left w:type="dxa" w:w="90"/>
+              <w:bottom w:type="dxa" w:w="60"/>
+              <w:right w:type="dxa" w:w="90"/>
+            </w:tcMar>
+          </w:tcPr>
+          <w:p>
+            <w:pPr>
+              <w:jc w:val="left"/>
+            </w:pPr>
+            <w:r>
+              <w:rPr>
+                <w:rFonts w:ascii="Arial" w:cs="Arial" w:eastAsia="Arial" w:hAnsi="Arial"/>
+                <w:sz w:val="18"/>
+                <w:szCs w:val="18"/>
+              </w:rPr>
+              <w:t xml:space="preserve">55,9 M</w:t>
+            </w:r>
+          </w:p>
+        </w:tc>
+        <w:tc>
+          <w:tcPr>
+            <w:tcW w:type="dxa" w:w="2300"/>
+            <w:tcMar>
+              <w:top w:type="dxa" w:w="60"/>
+              <w:left w:type="dxa" w:w="90"/>
+              <w:bottom w:type="dxa" w:w="60"/>
+              <w:right w:type="dxa" w:w="90"/>
+            </w:tcMar>
+          </w:tcPr>
+          <w:p>
+            <w:pPr>
+              <w:jc w:val="left"/>
+            </w:pPr>
+            <w:r>
+              <w:rPr>
+                <w:rFonts w:ascii="Arial" w:cs="Arial" w:eastAsia="Arial" w:hAnsi="Arial"/>
+                <w:sz w:val="18"/>
+                <w:szCs w:val="18"/>
+              </w:rPr>
+              <w:t xml:space="preserve">≈ 0</w:t>
+            </w:r>
+          </w:p>
+        </w:tc>
+      </w:tr>
+      <w:tr>
+        <w:trPr>
+          <w:tblHeader w:val="false"/>
+        </w:trPr>
+        <w:tc>
+          <w:tcPr>
+            <w:tcW w:type="dxa" w:w="5038"/>
+            <w:shd w:fill="F2F6FA" w:color="auto" w:val="clear"/>
+            <w:tcMar>
+              <w:top w:type="dxa" w:w="60"/>
+              <w:left w:type="dxa" w:w="90"/>
+              <w:bottom w:type="dxa" w:w="60"/>
+              <w:right w:type="dxa" w:w="90"/>
+            </w:tcMar>
+          </w:tcPr>
+          <w:p>
+            <w:pPr>
+              <w:jc w:val="left"/>
+            </w:pPr>
+            <w:r>
+              <w:rPr>
+                <w:rFonts w:ascii="Arial" w:cs="Arial" w:eastAsia="Arial" w:hAnsi="Arial"/>
+                <w:sz w:val="18"/>
+                <w:szCs w:val="18"/>
+              </w:rPr>
+              <w:t xml:space="preserve">Ouverture en oct. 2031, 2 000 €/mois dès 2028</w:t>
+            </w:r>
+          </w:p>
+        </w:tc>
+        <w:tc>
+          <w:tcPr>
+            <w:tcW w:type="dxa" w:w="2300"/>
+            <w:shd w:fill="F2F6FA" w:color="auto" w:val="clear"/>
+            <w:tcMar>
+              <w:top w:type="dxa" w:w="60"/>
+              <w:left w:type="dxa" w:w="90"/>
+              <w:bottom w:type="dxa" w:w="60"/>
+              <w:right w:type="dxa" w:w="90"/>
+            </w:tcMar>
+          </w:tcPr>
+          <w:p>
+            <w:pPr>
+              <w:jc w:val="left"/>
+            </w:pPr>
+            <w:r>
+              <w:rPr>
+                <w:rFonts w:ascii="Arial" w:cs="Arial" w:eastAsia="Arial" w:hAnsi="Arial"/>
+                <w:sz w:val="18"/>
+                <w:szCs w:val="18"/>
+              </w:rPr>
+              <w:t xml:space="preserve">61,8 M</w:t>
+            </w:r>
+          </w:p>
+        </w:tc>
+        <w:tc>
+          <w:tcPr>
+            <w:tcW w:type="dxa" w:w="2300"/>
+            <w:shd w:fill="F2F6FA" w:color="auto" w:val="clear"/>
+            <w:tcMar>
+              <w:top w:type="dxa" w:w="60"/>
+              <w:left w:type="dxa" w:w="90"/>
+              <w:bottom w:type="dxa" w:w="60"/>
+              <w:right w:type="dxa" w:w="90"/>
+            </w:tcMar>
+          </w:tcPr>
+          <w:p>
+            <w:pPr>
+              <w:jc w:val="left"/>
+            </w:pPr>
+            <w:r>
+              <w:rPr>
+                <w:rFonts w:ascii="Arial" w:cs="Arial" w:eastAsia="Arial" w:hAnsi="Arial"/>
+                <w:sz w:val="18"/>
+                <w:szCs w:val="18"/>
+              </w:rPr>
+              <w:t xml:space="preserve">+ 4,8 M</w:t>
+            </w:r>
+          </w:p>
+        </w:tc>
+      </w:tr>
+    </w:tbl>
+    <w:p>
+      <w:pPr>
+        <w:spacing w:after="80"/>
+      </w:pPr>
     </w:p>
     <w:p>
       <w:pPr>
-        <w:pStyle w:val="ListParagraph"/>
-        <w:numPr>
-          <w:ilvl w:val="0"/>
-          <w:numId w:val="2"/>
-        </w:numPr>
-        <w:spacing w:after="60"/>
+        <w:spacing w:after="120" w:line="276"/>
+        <w:jc w:val="both"/>
       </w:pPr>
       <w:r>
         <w:rPr>
@@ -6690,75 +7202,7 @@
           <w:sz w:val="21"/>
           <w:szCs w:val="21"/>
         </w:rPr>
-        <w:t xml:space="preserve">Crédit-bail sur les machines et le véhicule (10 à 20 M FCFA).</w:t>
-      </w:r>
-    </w:p>
-    <w:p>
-      <w:pPr>
-        <w:pStyle w:val="ListParagraph"/>
-        <w:numPr>
-          <w:ilvl w:val="0"/>
-          <w:numId w:val="2"/>
-        </w:numPr>
-        <w:spacing w:after="60"/>
-      </w:pPr>
-      <w:r>
-        <w:rPr>
-          <w:rFonts w:ascii="Arial" w:cs="Arial" w:eastAsia="Arial" w:hAnsi="Arial"/>
-          <w:sz w:val="21"/>
-          <w:szCs w:val="21"/>
-        </w:rPr>
-        <w:t xml:space="preserve">Prêt bancaire adossé à un fonds de garantie (FONGIP, dispositifs pour la diaspora : à vérifier) une fois les lettres d'intention obtenues.</w:t>
-      </w:r>
-    </w:p>
-    <w:p>
-      <w:pPr>
-        <w:pStyle w:val="ListParagraph"/>
-        <w:numPr>
-          <w:ilvl w:val="0"/>
-          <w:numId w:val="2"/>
-        </w:numPr>
-        <w:spacing w:after="60"/>
-      </w:pPr>
-      <w:r>
-        <w:rPr>
-          <w:rFonts w:ascii="Arial" w:cs="Arial" w:eastAsia="Arial" w:hAnsi="Arial"/>
-          <w:sz w:val="21"/>
-          <w:szCs w:val="21"/>
-        </w:rPr>
-        <w:t xml:space="preserve">Apports familiaux en compte courant d'associé, cohérents avec l'ambition d'entreprise familiale.</w:t>
-      </w:r>
-    </w:p>
-    <w:p>
-      <w:pPr>
-        <w:pStyle w:val="ListParagraph"/>
-        <w:numPr>
-          <w:ilvl w:val="0"/>
-          <w:numId w:val="2"/>
-        </w:numPr>
-        <w:spacing w:after="60"/>
-      </w:pPr>
-      <w:r>
-        <w:rPr>
-          <w:rFonts w:ascii="Arial" w:cs="Arial" w:eastAsia="Arial" w:hAnsi="Arial"/>
-          <w:sz w:val="21"/>
-          <w:szCs w:val="21"/>
-        </w:rPr>
-        <w:t xml:space="preserve">Réduction du BFR (dépôt de garantie sur le linge loué, paiement à 30 jours) et investissement encore plus frugal.</w:t>
-      </w:r>
-    </w:p>
-    <w:p>
-      <w:pPr>
-        <w:spacing w:after="120" w:line="276"/>
-        <w:jc w:val="both"/>
-      </w:pPr>
-      <w:r>
-        <w:rPr>
-          <w:rFonts w:ascii="Arial" w:cs="Arial" w:eastAsia="Arial" w:hAnsi="Arial"/>
-          <w:sz w:val="21"/>
-          <w:szCs w:val="21"/>
-        </w:rPr>
-        <w:t xml:space="preserve">Dans le scénario central, la société génère de la trésorerie dès l'année 2 et peut commencer à rembourser un prêt ou le compte courant d'associé à partir de l'année 3.</w:t>
+        <w:t xml:space="preserve">La date d'ouverture définitive sera fixée à la décision go / no-go de mars 2028, avec les prix réels du marché. Le projet ne démarrera pas sous-financé. Dans le scénario central, la société génère de la trésorerie dès l'année 2 et couvre ses loyers de crédit-bail.</w:t>
       </w:r>
     </w:p>
     <w:p>
@@ -6956,7 +7400,7 @@
                 <w:sz w:val="18"/>
                 <w:szCs w:val="18"/>
               </w:rPr>
-              <w:t xml:space="preserve">Investissement frugal, crédit-bail, prêt garanti, apports familiaux ; pas de démarrage sous-financé</w:t>
+              <w:t xml:space="preserve">Crédit-bail sur les machines, investissement frugal, épargne accrue ; date d'ouverture ajustée ; pas de démarrage sous-financé</w:t>
             </w:r>
           </w:p>
         </w:tc>
@@ -7865,7 +8309,7 @@
                 <w:sz w:val="18"/>
                 <w:szCs w:val="18"/>
               </w:rPr>
-              <w:t xml:space="preserve">≥ 6 lettres d'intention (≥ 300 kg/jour) ; banque ; devis</w:t>
+              <w:t xml:space="preserve">≥ 6 lettres d'intention (≥ 300 kg/jour) ; sociétés de crédit-bail ; devis</w:t>
             </w:r>
           </w:p>
         </w:tc>
@@ -8022,7 +8466,7 @@
                 <w:sz w:val="18"/>
                 <w:szCs w:val="18"/>
               </w:rPr>
-              <w:t xml:space="preserve">Écart de financement ramené à zéro</w:t>
+              <w:t xml:space="preserve">Offres de crédit-bail ; date d'ouverture confirmée</w:t>
             </w:r>
           </w:p>
         </w:tc>
@@ -8209,7 +8653,7 @@
                 <w:sz w:val="18"/>
                 <w:szCs w:val="18"/>
               </w:rPr>
-              <w:t xml:space="preserve">Oct. 2030</w:t>
+              <w:t xml:space="preserve">Oct. 2030 (2032-2034 selon l'épargne)</w:t>
             </w:r>
           </w:p>
         </w:tc>
@@ -8259,7 +8703,7 @@
                 <w:sz w:val="18"/>
                 <w:szCs w:val="18"/>
               </w:rPr>
-              <w:t xml:space="preserve">Premiers contrats ; EBE positif visé vers juin 2031</w:t>
+              <w:t xml:space="preserve">Premiers contrats ; EBE positif environ 9 mois après l'ouverture</w:t>
             </w:r>
           </w:p>
         </w:tc>

</xml_diff>